<commit_message>
update project Readme perf for 9 category types for hybrid/ensemble, PatchCore scoring: k-NN and softmax reweighting, remove duplicate section and finally update ensemble learnings
</commit_message>
<xml_diff>
--- a/Project_Proposal_Template.docx
+++ b/Project_Proposal_Template.docx
@@ -1,6 +1,6 @@
 
 <file path=word/document.xml><?xml version="1.0" encoding="utf-8"?>
-<w:document xmlns:wpc="http://schemas.microsoft.com/office/word/2010/wordprocessingCanvas" xmlns:cx="http://schemas.microsoft.com/office/drawing/2014/chartex" xmlns:cx1="http://schemas.microsoft.com/office/drawing/2015/9/8/chartex" xmlns:cx2="http://schemas.microsoft.com/office/drawing/2015/10/21/chartex" xmlns:cx3="http://schemas.microsoft.com/office/drawing/2016/5/9/chartex" xmlns:cx4="http://schemas.microsoft.com/office/drawing/2016/5/10/chartex" xmlns:cx5="http://schemas.microsoft.com/office/drawing/2016/5/11/chartex" xmlns:cx6="http://schemas.microsoft.com/office/drawing/2016/5/12/chartex" xmlns:cx7="http://schemas.microsoft.com/office/drawing/2016/5/13/chartex" xmlns:cx8="http://schemas.microsoft.com/office/drawing/2016/5/14/chartex" xmlns:mc="http://schemas.openxmlformats.org/markup-compatibility/2006" xmlns:aink="http://schemas.microsoft.com/office/drawing/2016/ink" xmlns:am3d="http://schemas.microsoft.com/office/drawing/2017/model3d" xmlns:o="urn:schemas-microsoft-com:office:office" xmlns:r="http://schemas.openxmlformats.org/officeDocument/2006/relationships" xmlns:m="http://schemas.openxmlformats.org/officeDocument/2006/math" xmlns:v="urn:schemas-microsoft-com:vml" xmlns:wp14="http://schemas.microsoft.com/office/word/2010/wordprocessingDrawing" xmlns:wp="http://schemas.openxmlformats.org/drawingml/2006/wordprocessingDrawing" xmlns:w10="urn:schemas-microsoft-com:office:word" xmlns:w="http://schemas.openxmlformats.org/wordprocessingml/2006/main" xmlns:w14="http://schemas.microsoft.com/office/word/2010/wordml" xmlns:w15="http://schemas.microsoft.com/office/word/2012/wordml" xmlns:w16cid="http://schemas.microsoft.com/office/word/2016/wordml/cid" xmlns:w16se="http://schemas.microsoft.com/office/word/2015/wordml/symex" xmlns:wpg="http://schemas.microsoft.com/office/word/2010/wordprocessingGroup" xmlns:wpi="http://schemas.microsoft.com/office/word/2010/wordprocessingInk" xmlns:wne="http://schemas.microsoft.com/office/word/2006/wordml" xmlns:wps="http://schemas.microsoft.com/office/word/2010/wordprocessingShape" mc:Ignorable="w14 w15 w16se w16cid wp14">
+<w:document xmlns:wpc="http://schemas.microsoft.com/office/word/2010/wordprocessingCanvas" xmlns:cx="http://schemas.microsoft.com/office/drawing/2014/chartex" xmlns:cx1="http://schemas.microsoft.com/office/drawing/2015/9/8/chartex" xmlns:cx2="http://schemas.microsoft.com/office/drawing/2015/10/21/chartex" xmlns:cx3="http://schemas.microsoft.com/office/drawing/2016/5/9/chartex" xmlns:cx4="http://schemas.microsoft.com/office/drawing/2016/5/10/chartex" xmlns:cx5="http://schemas.microsoft.com/office/drawing/2016/5/11/chartex" xmlns:cx6="http://schemas.microsoft.com/office/drawing/2016/5/12/chartex" xmlns:cx7="http://schemas.microsoft.com/office/drawing/2016/5/13/chartex" xmlns:cx8="http://schemas.microsoft.com/office/drawing/2016/5/14/chartex" xmlns:mc="http://schemas.openxmlformats.org/markup-compatibility/2006" xmlns:aink="http://schemas.microsoft.com/office/drawing/2016/ink" xmlns:am3d="http://schemas.microsoft.com/office/drawing/2017/model3d" xmlns:o="urn:schemas-microsoft-com:office:office" xmlns:oel="http://schemas.microsoft.com/office/2019/extlst" xmlns:r="http://schemas.openxmlformats.org/officeDocument/2006/relationships" xmlns:m="http://schemas.openxmlformats.org/officeDocument/2006/math" xmlns:v="urn:schemas-microsoft-com:vml" xmlns:wp14="http://schemas.microsoft.com/office/word/2010/wordprocessingDrawing" xmlns:wp="http://schemas.openxmlformats.org/drawingml/2006/wordprocessingDrawing" xmlns:w10="urn:schemas-microsoft-com:office:word" xmlns:w="http://schemas.openxmlformats.org/wordprocessingml/2006/main" xmlns:w14="http://schemas.microsoft.com/office/word/2010/wordml" xmlns:w15="http://schemas.microsoft.com/office/word/2012/wordml" xmlns:w16cex="http://schemas.microsoft.com/office/word/2018/wordml/cex" xmlns:w16cid="http://schemas.microsoft.com/office/word/2016/wordml/cid" xmlns:w16="http://schemas.microsoft.com/office/word/2018/wordml" xmlns:w16du="http://schemas.microsoft.com/office/word/2023/wordml/word16du" xmlns:w16sdtdh="http://schemas.microsoft.com/office/word/2020/wordml/sdtdatahash" xmlns:w16sdtfl="http://schemas.microsoft.com/office/word/2024/wordml/sdtformatlock" xmlns:w16se="http://schemas.microsoft.com/office/word/2015/wordml/symex" xmlns:wpg="http://schemas.microsoft.com/office/word/2010/wordprocessingGroup" xmlns:wpi="http://schemas.microsoft.com/office/word/2010/wordprocessingInk" xmlns:wne="http://schemas.microsoft.com/office/word/2006/wordml" xmlns:wps="http://schemas.microsoft.com/office/word/2010/wordprocessingShape" mc:Ignorable="w14 w15 w16se w16cid w16 w16cex w16sdtdh w16sdtfl w16du wp14">
   <w:body>
     <w:p>
       <w:pPr>
@@ -338,6 +338,46 @@
               </w:rPr>
             </w:pPr>
           </w:p>
+          <w:p>
+            <w:pPr>
+              <w:rPr>
+                <w:i/>
+              </w:rPr>
+            </w:pPr>
+          </w:p>
+          <w:p>
+            <w:r>
+              <w:t xml:space="preserve">Use Case 1: Object Classification (15 types) </w:t>
+            </w:r>
+          </w:p>
+          <w:p>
+            <w:r>
+              <w:t xml:space="preserve">Use Case 2: Defect Detection (Yes/No + Heatmap </w:t>
+            </w:r>
+            <w:proofErr w:type="spellStart"/>
+            <w:r>
+              <w:t>localisation</w:t>
+            </w:r>
+            <w:proofErr w:type="spellEnd"/>
+            <w:r>
+              <w:t>)</w:t>
+            </w:r>
+          </w:p>
+          <w:p>
+            <w:r>
+              <w:t>Use Case 3: Defect Type Classification (3-5 types per object)</w:t>
+            </w:r>
+          </w:p>
+          <w:p>
+            <w:r>
+              <w:t>Use Case 4: Defect Severity Classification (threshold levels)</w:t>
+            </w:r>
+          </w:p>
+          <w:p>
+            <w:r>
+              <w:t>Use Case 5: Multi Defect Classification (detect and classify different defects)</w:t>
+            </w:r>
+          </w:p>
           <w:p/>
           <w:p/>
           <w:p/>
@@ -951,8 +991,6 @@
                 <w:b/>
               </w:rPr>
             </w:pPr>
-            <w:bookmarkStart w:id="0" w:name="_GoBack"/>
-            <w:bookmarkEnd w:id="0"/>
           </w:p>
         </w:tc>
       </w:tr>
@@ -972,7 +1010,7 @@
 </file>
 
 <file path=word/endnotes.xml><?xml version="1.0" encoding="utf-8"?>
-<w:endnotes xmlns:wpc="http://schemas.microsoft.com/office/word/2010/wordprocessingCanvas" xmlns:cx="http://schemas.microsoft.com/office/drawing/2014/chartex" xmlns:cx1="http://schemas.microsoft.com/office/drawing/2015/9/8/chartex" xmlns:cx2="http://schemas.microsoft.com/office/drawing/2015/10/21/chartex" xmlns:cx3="http://schemas.microsoft.com/office/drawing/2016/5/9/chartex" xmlns:cx4="http://schemas.microsoft.com/office/drawing/2016/5/10/chartex" xmlns:cx5="http://schemas.microsoft.com/office/drawing/2016/5/11/chartex" xmlns:cx6="http://schemas.microsoft.com/office/drawing/2016/5/12/chartex" xmlns:cx7="http://schemas.microsoft.com/office/drawing/2016/5/13/chartex" xmlns:cx8="http://schemas.microsoft.com/office/drawing/2016/5/14/chartex" xmlns:mc="http://schemas.openxmlformats.org/markup-compatibility/2006" xmlns:aink="http://schemas.microsoft.com/office/drawing/2016/ink" xmlns:am3d="http://schemas.microsoft.com/office/drawing/2017/model3d" xmlns:o="urn:schemas-microsoft-com:office:office" xmlns:r="http://schemas.openxmlformats.org/officeDocument/2006/relationships" xmlns:m="http://schemas.openxmlformats.org/officeDocument/2006/math" xmlns:v="urn:schemas-microsoft-com:vml" xmlns:wp14="http://schemas.microsoft.com/office/word/2010/wordprocessingDrawing" xmlns:wp="http://schemas.openxmlformats.org/drawingml/2006/wordprocessingDrawing" xmlns:w10="urn:schemas-microsoft-com:office:word" xmlns:w="http://schemas.openxmlformats.org/wordprocessingml/2006/main" xmlns:w14="http://schemas.microsoft.com/office/word/2010/wordml" xmlns:w15="http://schemas.microsoft.com/office/word/2012/wordml" xmlns:w16cid="http://schemas.microsoft.com/office/word/2016/wordml/cid" xmlns:w16se="http://schemas.microsoft.com/office/word/2015/wordml/symex" xmlns:wpg="http://schemas.microsoft.com/office/word/2010/wordprocessingGroup" xmlns:wpi="http://schemas.microsoft.com/office/word/2010/wordprocessingInk" xmlns:wne="http://schemas.microsoft.com/office/word/2006/wordml" xmlns:wps="http://schemas.microsoft.com/office/word/2010/wordprocessingShape" mc:Ignorable="w14 w15 w16se w16cid wp14">
+<w:endnotes xmlns:wpc="http://schemas.microsoft.com/office/word/2010/wordprocessingCanvas" xmlns:cx="http://schemas.microsoft.com/office/drawing/2014/chartex" xmlns:cx1="http://schemas.microsoft.com/office/drawing/2015/9/8/chartex" xmlns:cx2="http://schemas.microsoft.com/office/drawing/2015/10/21/chartex" xmlns:cx3="http://schemas.microsoft.com/office/drawing/2016/5/9/chartex" xmlns:cx4="http://schemas.microsoft.com/office/drawing/2016/5/10/chartex" xmlns:cx5="http://schemas.microsoft.com/office/drawing/2016/5/11/chartex" xmlns:cx6="http://schemas.microsoft.com/office/drawing/2016/5/12/chartex" xmlns:cx7="http://schemas.microsoft.com/office/drawing/2016/5/13/chartex" xmlns:cx8="http://schemas.microsoft.com/office/drawing/2016/5/14/chartex" xmlns:mc="http://schemas.openxmlformats.org/markup-compatibility/2006" xmlns:aink="http://schemas.microsoft.com/office/drawing/2016/ink" xmlns:am3d="http://schemas.microsoft.com/office/drawing/2017/model3d" xmlns:o="urn:schemas-microsoft-com:office:office" xmlns:oel="http://schemas.microsoft.com/office/2019/extlst" xmlns:r="http://schemas.openxmlformats.org/officeDocument/2006/relationships" xmlns:m="http://schemas.openxmlformats.org/officeDocument/2006/math" xmlns:v="urn:schemas-microsoft-com:vml" xmlns:wp14="http://schemas.microsoft.com/office/word/2010/wordprocessingDrawing" xmlns:wp="http://schemas.openxmlformats.org/drawingml/2006/wordprocessingDrawing" xmlns:w10="urn:schemas-microsoft-com:office:word" xmlns:w="http://schemas.openxmlformats.org/wordprocessingml/2006/main" xmlns:w14="http://schemas.microsoft.com/office/word/2010/wordml" xmlns:w15="http://schemas.microsoft.com/office/word/2012/wordml" xmlns:w16cex="http://schemas.microsoft.com/office/word/2018/wordml/cex" xmlns:w16cid="http://schemas.microsoft.com/office/word/2016/wordml/cid" xmlns:w16="http://schemas.microsoft.com/office/word/2018/wordml" xmlns:w16du="http://schemas.microsoft.com/office/word/2023/wordml/word16du" xmlns:w16sdtdh="http://schemas.microsoft.com/office/word/2020/wordml/sdtdatahash" xmlns:w16sdtfl="http://schemas.microsoft.com/office/word/2024/wordml/sdtformatlock" xmlns:w16se="http://schemas.microsoft.com/office/word/2015/wordml/symex" xmlns:wpg="http://schemas.microsoft.com/office/word/2010/wordprocessingGroup" xmlns:wpi="http://schemas.microsoft.com/office/word/2010/wordprocessingInk" xmlns:wne="http://schemas.microsoft.com/office/word/2006/wordml" xmlns:wps="http://schemas.microsoft.com/office/word/2010/wordprocessingShape" mc:Ignorable="w14 w15 w16se w16cid w16 w16cex w16sdtdh w16sdtfl w16du wp14">
   <w:endnote w:type="separator" w:id="-1">
     <w:p>
       <w:r>
@@ -991,7 +1029,7 @@
 </file>
 
 <file path=word/footer1.xml><?xml version="1.0" encoding="utf-8"?>
-<w:ftr xmlns:wpc="http://schemas.microsoft.com/office/word/2010/wordprocessingCanvas" xmlns:cx="http://schemas.microsoft.com/office/drawing/2014/chartex" xmlns:cx1="http://schemas.microsoft.com/office/drawing/2015/9/8/chartex" xmlns:cx2="http://schemas.microsoft.com/office/drawing/2015/10/21/chartex" xmlns:cx3="http://schemas.microsoft.com/office/drawing/2016/5/9/chartex" xmlns:cx4="http://schemas.microsoft.com/office/drawing/2016/5/10/chartex" xmlns:cx5="http://schemas.microsoft.com/office/drawing/2016/5/11/chartex" xmlns:cx6="http://schemas.microsoft.com/office/drawing/2016/5/12/chartex" xmlns:cx7="http://schemas.microsoft.com/office/drawing/2016/5/13/chartex" xmlns:cx8="http://schemas.microsoft.com/office/drawing/2016/5/14/chartex" xmlns:mc="http://schemas.openxmlformats.org/markup-compatibility/2006" xmlns:aink="http://schemas.microsoft.com/office/drawing/2016/ink" xmlns:am3d="http://schemas.microsoft.com/office/drawing/2017/model3d" xmlns:o="urn:schemas-microsoft-com:office:office" xmlns:r="http://schemas.openxmlformats.org/officeDocument/2006/relationships" xmlns:m="http://schemas.openxmlformats.org/officeDocument/2006/math" xmlns:v="urn:schemas-microsoft-com:vml" xmlns:wp14="http://schemas.microsoft.com/office/word/2010/wordprocessingDrawing" xmlns:wp="http://schemas.openxmlformats.org/drawingml/2006/wordprocessingDrawing" xmlns:w10="urn:schemas-microsoft-com:office:word" xmlns:w="http://schemas.openxmlformats.org/wordprocessingml/2006/main" xmlns:w14="http://schemas.microsoft.com/office/word/2010/wordml" xmlns:w15="http://schemas.microsoft.com/office/word/2012/wordml" xmlns:w16cid="http://schemas.microsoft.com/office/word/2016/wordml/cid" xmlns:w16se="http://schemas.microsoft.com/office/word/2015/wordml/symex" xmlns:wpg="http://schemas.microsoft.com/office/word/2010/wordprocessingGroup" xmlns:wpi="http://schemas.microsoft.com/office/word/2010/wordprocessingInk" xmlns:wne="http://schemas.microsoft.com/office/word/2006/wordml" xmlns:wps="http://schemas.microsoft.com/office/word/2010/wordprocessingShape" mc:Ignorable="w14 w15 w16se w16cid wp14">
+<w:ftr xmlns:wpc="http://schemas.microsoft.com/office/word/2010/wordprocessingCanvas" xmlns:cx="http://schemas.microsoft.com/office/drawing/2014/chartex" xmlns:cx1="http://schemas.microsoft.com/office/drawing/2015/9/8/chartex" xmlns:cx2="http://schemas.microsoft.com/office/drawing/2015/10/21/chartex" xmlns:cx3="http://schemas.microsoft.com/office/drawing/2016/5/9/chartex" xmlns:cx4="http://schemas.microsoft.com/office/drawing/2016/5/10/chartex" xmlns:cx5="http://schemas.microsoft.com/office/drawing/2016/5/11/chartex" xmlns:cx6="http://schemas.microsoft.com/office/drawing/2016/5/12/chartex" xmlns:cx7="http://schemas.microsoft.com/office/drawing/2016/5/13/chartex" xmlns:cx8="http://schemas.microsoft.com/office/drawing/2016/5/14/chartex" xmlns:mc="http://schemas.openxmlformats.org/markup-compatibility/2006" xmlns:aink="http://schemas.microsoft.com/office/drawing/2016/ink" xmlns:am3d="http://schemas.microsoft.com/office/drawing/2017/model3d" xmlns:o="urn:schemas-microsoft-com:office:office" xmlns:oel="http://schemas.microsoft.com/office/2019/extlst" xmlns:r="http://schemas.openxmlformats.org/officeDocument/2006/relationships" xmlns:m="http://schemas.openxmlformats.org/officeDocument/2006/math" xmlns:v="urn:schemas-microsoft-com:vml" xmlns:wp14="http://schemas.microsoft.com/office/word/2010/wordprocessingDrawing" xmlns:wp="http://schemas.openxmlformats.org/drawingml/2006/wordprocessingDrawing" xmlns:w10="urn:schemas-microsoft-com:office:word" xmlns:w="http://schemas.openxmlformats.org/wordprocessingml/2006/main" xmlns:w14="http://schemas.microsoft.com/office/word/2010/wordml" xmlns:w15="http://schemas.microsoft.com/office/word/2012/wordml" xmlns:w16cex="http://schemas.microsoft.com/office/word/2018/wordml/cex" xmlns:w16cid="http://schemas.microsoft.com/office/word/2016/wordml/cid" xmlns:w16="http://schemas.microsoft.com/office/word/2018/wordml" xmlns:w16du="http://schemas.microsoft.com/office/word/2023/wordml/word16du" xmlns:w16sdtdh="http://schemas.microsoft.com/office/word/2020/wordml/sdtdatahash" xmlns:w16sdtfl="http://schemas.microsoft.com/office/word/2024/wordml/sdtformatlock" xmlns:w16se="http://schemas.microsoft.com/office/word/2015/wordml/symex" xmlns:wpg="http://schemas.microsoft.com/office/word/2010/wordprocessingGroup" xmlns:wpi="http://schemas.microsoft.com/office/word/2010/wordprocessingInk" xmlns:wne="http://schemas.microsoft.com/office/word/2006/wordml" xmlns:wps="http://schemas.microsoft.com/office/word/2010/wordprocessingShape" mc:Ignorable="w14 w15 w16se w16cid w16 w16cex w16sdtdh w16sdtfl w16du wp14">
   <w:p>
     <w:pPr>
       <w:pStyle w:val="Footer"/>
@@ -1003,6 +1041,9 @@
       <w:tab/>
     </w:r>
     <w:r>
+      <w:rPr>
+        <w:noProof/>
+      </w:rPr>
       <w:drawing>
         <wp:inline distT="0" distB="0" distL="0" distR="0" wp14:anchorId="13F86AAD" wp14:editId="3C21338F">
           <wp:extent cx="1593210" cy="562610"/>
@@ -1058,7 +1099,7 @@
 </file>
 
 <file path=word/footnotes.xml><?xml version="1.0" encoding="utf-8"?>
-<w:footnotes xmlns:wpc="http://schemas.microsoft.com/office/word/2010/wordprocessingCanvas" xmlns:cx="http://schemas.microsoft.com/office/drawing/2014/chartex" xmlns:cx1="http://schemas.microsoft.com/office/drawing/2015/9/8/chartex" xmlns:cx2="http://schemas.microsoft.com/office/drawing/2015/10/21/chartex" xmlns:cx3="http://schemas.microsoft.com/office/drawing/2016/5/9/chartex" xmlns:cx4="http://schemas.microsoft.com/office/drawing/2016/5/10/chartex" xmlns:cx5="http://schemas.microsoft.com/office/drawing/2016/5/11/chartex" xmlns:cx6="http://schemas.microsoft.com/office/drawing/2016/5/12/chartex" xmlns:cx7="http://schemas.microsoft.com/office/drawing/2016/5/13/chartex" xmlns:cx8="http://schemas.microsoft.com/office/drawing/2016/5/14/chartex" xmlns:mc="http://schemas.openxmlformats.org/markup-compatibility/2006" xmlns:aink="http://schemas.microsoft.com/office/drawing/2016/ink" xmlns:am3d="http://schemas.microsoft.com/office/drawing/2017/model3d" xmlns:o="urn:schemas-microsoft-com:office:office" xmlns:r="http://schemas.openxmlformats.org/officeDocument/2006/relationships" xmlns:m="http://schemas.openxmlformats.org/officeDocument/2006/math" xmlns:v="urn:schemas-microsoft-com:vml" xmlns:wp14="http://schemas.microsoft.com/office/word/2010/wordprocessingDrawing" xmlns:wp="http://schemas.openxmlformats.org/drawingml/2006/wordprocessingDrawing" xmlns:w10="urn:schemas-microsoft-com:office:word" xmlns:w="http://schemas.openxmlformats.org/wordprocessingml/2006/main" xmlns:w14="http://schemas.microsoft.com/office/word/2010/wordml" xmlns:w15="http://schemas.microsoft.com/office/word/2012/wordml" xmlns:w16cid="http://schemas.microsoft.com/office/word/2016/wordml/cid" xmlns:w16se="http://schemas.microsoft.com/office/word/2015/wordml/symex" xmlns:wpg="http://schemas.microsoft.com/office/word/2010/wordprocessingGroup" xmlns:wpi="http://schemas.microsoft.com/office/word/2010/wordprocessingInk" xmlns:wne="http://schemas.microsoft.com/office/word/2006/wordml" xmlns:wps="http://schemas.microsoft.com/office/word/2010/wordprocessingShape" mc:Ignorable="w14 w15 w16se w16cid wp14">
+<w:footnotes xmlns:wpc="http://schemas.microsoft.com/office/word/2010/wordprocessingCanvas" xmlns:cx="http://schemas.microsoft.com/office/drawing/2014/chartex" xmlns:cx1="http://schemas.microsoft.com/office/drawing/2015/9/8/chartex" xmlns:cx2="http://schemas.microsoft.com/office/drawing/2015/10/21/chartex" xmlns:cx3="http://schemas.microsoft.com/office/drawing/2016/5/9/chartex" xmlns:cx4="http://schemas.microsoft.com/office/drawing/2016/5/10/chartex" xmlns:cx5="http://schemas.microsoft.com/office/drawing/2016/5/11/chartex" xmlns:cx6="http://schemas.microsoft.com/office/drawing/2016/5/12/chartex" xmlns:cx7="http://schemas.microsoft.com/office/drawing/2016/5/13/chartex" xmlns:cx8="http://schemas.microsoft.com/office/drawing/2016/5/14/chartex" xmlns:mc="http://schemas.openxmlformats.org/markup-compatibility/2006" xmlns:aink="http://schemas.microsoft.com/office/drawing/2016/ink" xmlns:am3d="http://schemas.microsoft.com/office/drawing/2017/model3d" xmlns:o="urn:schemas-microsoft-com:office:office" xmlns:oel="http://schemas.microsoft.com/office/2019/extlst" xmlns:r="http://schemas.openxmlformats.org/officeDocument/2006/relationships" xmlns:m="http://schemas.openxmlformats.org/officeDocument/2006/math" xmlns:v="urn:schemas-microsoft-com:vml" xmlns:wp14="http://schemas.microsoft.com/office/word/2010/wordprocessingDrawing" xmlns:wp="http://schemas.openxmlformats.org/drawingml/2006/wordprocessingDrawing" xmlns:w10="urn:schemas-microsoft-com:office:word" xmlns:w="http://schemas.openxmlformats.org/wordprocessingml/2006/main" xmlns:w14="http://schemas.microsoft.com/office/word/2010/wordml" xmlns:w15="http://schemas.microsoft.com/office/word/2012/wordml" xmlns:w16cex="http://schemas.microsoft.com/office/word/2018/wordml/cex" xmlns:w16cid="http://schemas.microsoft.com/office/word/2016/wordml/cid" xmlns:w16="http://schemas.microsoft.com/office/word/2018/wordml" xmlns:w16du="http://schemas.microsoft.com/office/word/2023/wordml/word16du" xmlns:w16sdtdh="http://schemas.microsoft.com/office/word/2020/wordml/sdtdatahash" xmlns:w16sdtfl="http://schemas.microsoft.com/office/word/2024/wordml/sdtformatlock" xmlns:w16se="http://schemas.microsoft.com/office/word/2015/wordml/symex" xmlns:wpg="http://schemas.microsoft.com/office/word/2010/wordprocessingGroup" xmlns:wpi="http://schemas.microsoft.com/office/word/2010/wordprocessingInk" xmlns:wne="http://schemas.microsoft.com/office/word/2006/wordml" xmlns:wps="http://schemas.microsoft.com/office/word/2010/wordprocessingShape" mc:Ignorable="w14 w15 w16se w16cid w16 w16cex w16sdtdh w16sdtfl w16du wp14">
   <w:footnote w:type="separator" w:id="-1">
     <w:p>
       <w:r>
@@ -1077,7 +1118,7 @@
 </file>
 
 <file path=word/header1.xml><?xml version="1.0" encoding="utf-8"?>
-<w:hdr xmlns:wpc="http://schemas.microsoft.com/office/word/2010/wordprocessingCanvas" xmlns:cx="http://schemas.microsoft.com/office/drawing/2014/chartex" xmlns:cx1="http://schemas.microsoft.com/office/drawing/2015/9/8/chartex" xmlns:cx2="http://schemas.microsoft.com/office/drawing/2015/10/21/chartex" xmlns:cx3="http://schemas.microsoft.com/office/drawing/2016/5/9/chartex" xmlns:cx4="http://schemas.microsoft.com/office/drawing/2016/5/10/chartex" xmlns:cx5="http://schemas.microsoft.com/office/drawing/2016/5/11/chartex" xmlns:cx6="http://schemas.microsoft.com/office/drawing/2016/5/12/chartex" xmlns:cx7="http://schemas.microsoft.com/office/drawing/2016/5/13/chartex" xmlns:cx8="http://schemas.microsoft.com/office/drawing/2016/5/14/chartex" xmlns:mc="http://schemas.openxmlformats.org/markup-compatibility/2006" xmlns:aink="http://schemas.microsoft.com/office/drawing/2016/ink" xmlns:am3d="http://schemas.microsoft.com/office/drawing/2017/model3d" xmlns:o="urn:schemas-microsoft-com:office:office" xmlns:r="http://schemas.openxmlformats.org/officeDocument/2006/relationships" xmlns:m="http://schemas.openxmlformats.org/officeDocument/2006/math" xmlns:v="urn:schemas-microsoft-com:vml" xmlns:wp14="http://schemas.microsoft.com/office/word/2010/wordprocessingDrawing" xmlns:wp="http://schemas.openxmlformats.org/drawingml/2006/wordprocessingDrawing" xmlns:w10="urn:schemas-microsoft-com:office:word" xmlns:w="http://schemas.openxmlformats.org/wordprocessingml/2006/main" xmlns:w14="http://schemas.microsoft.com/office/word/2010/wordml" xmlns:w15="http://schemas.microsoft.com/office/word/2012/wordml" xmlns:w16cid="http://schemas.microsoft.com/office/word/2016/wordml/cid" xmlns:w16se="http://schemas.microsoft.com/office/word/2015/wordml/symex" xmlns:wpg="http://schemas.microsoft.com/office/word/2010/wordprocessingGroup" xmlns:wpi="http://schemas.microsoft.com/office/word/2010/wordprocessingInk" xmlns:wne="http://schemas.microsoft.com/office/word/2006/wordml" xmlns:wps="http://schemas.microsoft.com/office/word/2010/wordprocessingShape" mc:Ignorable="w14 w15 w16se w16cid wp14">
+<w:hdr xmlns:wpc="http://schemas.microsoft.com/office/word/2010/wordprocessingCanvas" xmlns:cx="http://schemas.microsoft.com/office/drawing/2014/chartex" xmlns:cx1="http://schemas.microsoft.com/office/drawing/2015/9/8/chartex" xmlns:cx2="http://schemas.microsoft.com/office/drawing/2015/10/21/chartex" xmlns:cx3="http://schemas.microsoft.com/office/drawing/2016/5/9/chartex" xmlns:cx4="http://schemas.microsoft.com/office/drawing/2016/5/10/chartex" xmlns:cx5="http://schemas.microsoft.com/office/drawing/2016/5/11/chartex" xmlns:cx6="http://schemas.microsoft.com/office/drawing/2016/5/12/chartex" xmlns:cx7="http://schemas.microsoft.com/office/drawing/2016/5/13/chartex" xmlns:cx8="http://schemas.microsoft.com/office/drawing/2016/5/14/chartex" xmlns:mc="http://schemas.openxmlformats.org/markup-compatibility/2006" xmlns:aink="http://schemas.microsoft.com/office/drawing/2016/ink" xmlns:am3d="http://schemas.microsoft.com/office/drawing/2017/model3d" xmlns:o="urn:schemas-microsoft-com:office:office" xmlns:oel="http://schemas.microsoft.com/office/2019/extlst" xmlns:r="http://schemas.openxmlformats.org/officeDocument/2006/relationships" xmlns:m="http://schemas.openxmlformats.org/officeDocument/2006/math" xmlns:v="urn:schemas-microsoft-com:vml" xmlns:wp14="http://schemas.microsoft.com/office/word/2010/wordprocessingDrawing" xmlns:wp="http://schemas.openxmlformats.org/drawingml/2006/wordprocessingDrawing" xmlns:w10="urn:schemas-microsoft-com:office:word" xmlns:w="http://schemas.openxmlformats.org/wordprocessingml/2006/main" xmlns:w14="http://schemas.microsoft.com/office/word/2010/wordml" xmlns:w15="http://schemas.microsoft.com/office/word/2012/wordml" xmlns:w16cex="http://schemas.microsoft.com/office/word/2018/wordml/cex" xmlns:w16cid="http://schemas.microsoft.com/office/word/2016/wordml/cid" xmlns:w16="http://schemas.microsoft.com/office/word/2018/wordml" xmlns:w16du="http://schemas.microsoft.com/office/word/2023/wordml/word16du" xmlns:w16sdtdh="http://schemas.microsoft.com/office/word/2020/wordml/sdtdatahash" xmlns:w16sdtfl="http://schemas.microsoft.com/office/word/2024/wordml/sdtformatlock" xmlns:w16se="http://schemas.microsoft.com/office/word/2015/wordml/symex" xmlns:wpg="http://schemas.microsoft.com/office/word/2010/wordprocessingGroup" xmlns:wpi="http://schemas.microsoft.com/office/word/2010/wordprocessingInk" xmlns:wne="http://schemas.microsoft.com/office/word/2006/wordml" xmlns:wps="http://schemas.microsoft.com/office/word/2010/wordprocessingShape" mc:Ignorable="w14 w15 w16se w16cid w16 w16cex w16sdtdh w16sdtfl w16du wp14">
   <w:p>
     <w:pPr>
       <w:pStyle w:val="Header"/>
@@ -1169,7 +1210,7 @@
 </file>
 
 <file path=word/numbering.xml><?xml version="1.0" encoding="utf-8"?>
-<w:numbering xmlns:wpc="http://schemas.microsoft.com/office/word/2010/wordprocessingCanvas" xmlns:cx="http://schemas.microsoft.com/office/drawing/2014/chartex" xmlns:cx1="http://schemas.microsoft.com/office/drawing/2015/9/8/chartex" xmlns:cx2="http://schemas.microsoft.com/office/drawing/2015/10/21/chartex" xmlns:cx3="http://schemas.microsoft.com/office/drawing/2016/5/9/chartex" xmlns:cx4="http://schemas.microsoft.com/office/drawing/2016/5/10/chartex" xmlns:cx5="http://schemas.microsoft.com/office/drawing/2016/5/11/chartex" xmlns:cx6="http://schemas.microsoft.com/office/drawing/2016/5/12/chartex" xmlns:cx7="http://schemas.microsoft.com/office/drawing/2016/5/13/chartex" xmlns:cx8="http://schemas.microsoft.com/office/drawing/2016/5/14/chartex" xmlns:mc="http://schemas.openxmlformats.org/markup-compatibility/2006" xmlns:aink="http://schemas.microsoft.com/office/drawing/2016/ink" xmlns:am3d="http://schemas.microsoft.com/office/drawing/2017/model3d" xmlns:o="urn:schemas-microsoft-com:office:office" xmlns:r="http://schemas.openxmlformats.org/officeDocument/2006/relationships" xmlns:m="http://schemas.openxmlformats.org/officeDocument/2006/math" xmlns:v="urn:schemas-microsoft-com:vml" xmlns:wp14="http://schemas.microsoft.com/office/word/2010/wordprocessingDrawing" xmlns:wp="http://schemas.openxmlformats.org/drawingml/2006/wordprocessingDrawing" xmlns:w10="urn:schemas-microsoft-com:office:word" xmlns:w="http://schemas.openxmlformats.org/wordprocessingml/2006/main" xmlns:w14="http://schemas.microsoft.com/office/word/2010/wordml" xmlns:w15="http://schemas.microsoft.com/office/word/2012/wordml" xmlns:w16cid="http://schemas.microsoft.com/office/word/2016/wordml/cid" xmlns:w16se="http://schemas.microsoft.com/office/word/2015/wordml/symex" xmlns:wpg="http://schemas.microsoft.com/office/word/2010/wordprocessingGroup" xmlns:wpi="http://schemas.microsoft.com/office/word/2010/wordprocessingInk" xmlns:wne="http://schemas.microsoft.com/office/word/2006/wordml" xmlns:wps="http://schemas.microsoft.com/office/word/2010/wordprocessingShape" mc:Ignorable="w14 w15 w16se w16cid wp14">
+<w:numbering xmlns:wpc="http://schemas.microsoft.com/office/word/2010/wordprocessingCanvas" xmlns:cx="http://schemas.microsoft.com/office/drawing/2014/chartex" xmlns:cx1="http://schemas.microsoft.com/office/drawing/2015/9/8/chartex" xmlns:cx2="http://schemas.microsoft.com/office/drawing/2015/10/21/chartex" xmlns:cx3="http://schemas.microsoft.com/office/drawing/2016/5/9/chartex" xmlns:cx4="http://schemas.microsoft.com/office/drawing/2016/5/10/chartex" xmlns:cx5="http://schemas.microsoft.com/office/drawing/2016/5/11/chartex" xmlns:cx6="http://schemas.microsoft.com/office/drawing/2016/5/12/chartex" xmlns:cx7="http://schemas.microsoft.com/office/drawing/2016/5/13/chartex" xmlns:cx8="http://schemas.microsoft.com/office/drawing/2016/5/14/chartex" xmlns:mc="http://schemas.openxmlformats.org/markup-compatibility/2006" xmlns:aink="http://schemas.microsoft.com/office/drawing/2016/ink" xmlns:am3d="http://schemas.microsoft.com/office/drawing/2017/model3d" xmlns:o="urn:schemas-microsoft-com:office:office" xmlns:oel="http://schemas.microsoft.com/office/2019/extlst" xmlns:r="http://schemas.openxmlformats.org/officeDocument/2006/relationships" xmlns:m="http://schemas.openxmlformats.org/officeDocument/2006/math" xmlns:v="urn:schemas-microsoft-com:vml" xmlns:wp14="http://schemas.microsoft.com/office/word/2010/wordprocessingDrawing" xmlns:wp="http://schemas.openxmlformats.org/drawingml/2006/wordprocessingDrawing" xmlns:w10="urn:schemas-microsoft-com:office:word" xmlns:w="http://schemas.openxmlformats.org/wordprocessingml/2006/main" xmlns:w14="http://schemas.microsoft.com/office/word/2010/wordml" xmlns:w15="http://schemas.microsoft.com/office/word/2012/wordml" xmlns:w16cex="http://schemas.microsoft.com/office/word/2018/wordml/cex" xmlns:w16cid="http://schemas.microsoft.com/office/word/2016/wordml/cid" xmlns:w16="http://schemas.microsoft.com/office/word/2018/wordml" xmlns:w16du="http://schemas.microsoft.com/office/word/2023/wordml/word16du" xmlns:w16sdtdh="http://schemas.microsoft.com/office/word/2020/wordml/sdtdatahash" xmlns:w16sdtfl="http://schemas.microsoft.com/office/word/2024/wordml/sdtformatlock" xmlns:w16se="http://schemas.microsoft.com/office/word/2015/wordml/symex" xmlns:wpg="http://schemas.microsoft.com/office/word/2010/wordprocessingGroup" xmlns:wpi="http://schemas.microsoft.com/office/word/2010/wordprocessingInk" xmlns:wne="http://schemas.microsoft.com/office/word/2006/wordml" xmlns:wps="http://schemas.microsoft.com/office/word/2010/wordprocessingShape" mc:Ignorable="w14 w15 w16se w16cid w16 w16cex w16sdtdh w16sdtfl w16du wp14">
   <w:abstractNum w:abstractNumId="0" w15:restartNumberingAfterBreak="0">
     <w:nsid w:val="468D5339"/>
     <w:multiLevelType w:val="hybridMultilevel"/>
@@ -1259,14 +1300,14 @@
       </w:pPr>
     </w:lvl>
   </w:abstractNum>
-  <w:num w:numId="1">
+  <w:num w:numId="1" w16cid:durableId="1206679084">
     <w:abstractNumId w:val="0"/>
   </w:num>
 </w:numbering>
 </file>
 
 <file path=word/styles.xml><?xml version="1.0" encoding="utf-8"?>
-<w:styles xmlns:mc="http://schemas.openxmlformats.org/markup-compatibility/2006" xmlns:r="http://schemas.openxmlformats.org/officeDocument/2006/relationships" xmlns:w="http://schemas.openxmlformats.org/wordprocessingml/2006/main" xmlns:w14="http://schemas.microsoft.com/office/word/2010/wordml" xmlns:w15="http://schemas.microsoft.com/office/word/2012/wordml" xmlns:w16cid="http://schemas.microsoft.com/office/word/2016/wordml/cid" xmlns:w16se="http://schemas.microsoft.com/office/word/2015/wordml/symex" mc:Ignorable="w14 w15 w16se w16cid">
+<w:styles xmlns:mc="http://schemas.openxmlformats.org/markup-compatibility/2006" xmlns:r="http://schemas.openxmlformats.org/officeDocument/2006/relationships" xmlns:w="http://schemas.openxmlformats.org/wordprocessingml/2006/main" xmlns:w14="http://schemas.microsoft.com/office/word/2010/wordml" xmlns:w15="http://schemas.microsoft.com/office/word/2012/wordml" xmlns:w16cex="http://schemas.microsoft.com/office/word/2018/wordml/cex" xmlns:w16cid="http://schemas.microsoft.com/office/word/2016/wordml/cid" xmlns:w16="http://schemas.microsoft.com/office/word/2018/wordml" xmlns:w16du="http://schemas.microsoft.com/office/word/2023/wordml/word16du" xmlns:w16sdtdh="http://schemas.microsoft.com/office/word/2020/wordml/sdtdatahash" xmlns:w16sdtfl="http://schemas.microsoft.com/office/word/2024/wordml/sdtformatlock" xmlns:w16se="http://schemas.microsoft.com/office/word/2015/wordml/symex" mc:Ignorable="w14 w15 w16se w16cid w16 w16cex w16sdtdh w16sdtfl w16du">
   <w:docDefaults>
     <w:rPrDefault>
       <w:rPr>
@@ -1276,7 +1317,7 @@
     </w:rPrDefault>
     <w:pPrDefault/>
   </w:docDefaults>
-  <w:latentStyles w:defLockedState="0" w:defUIPriority="0" w:defSemiHidden="0" w:defUnhideWhenUsed="0" w:defQFormat="0" w:count="375">
+  <w:latentStyles w:defLockedState="0" w:defUIPriority="0" w:defSemiHidden="0" w:defUnhideWhenUsed="0" w:defQFormat="0" w:count="376">
     <w:lsdException w:name="Normal" w:qFormat="1"/>
     <w:lsdException w:name="heading 1" w:qFormat="1"/>
     <w:lsdException w:name="heading 2" w:semiHidden="1" w:unhideWhenUsed="1" w:qFormat="1"/>
@@ -1645,6 +1686,7 @@
     <w:lsdException w:name="Smart Hyperlink" w:semiHidden="1" w:uiPriority="99" w:unhideWhenUsed="1"/>
     <w:lsdException w:name="Hashtag" w:semiHidden="1" w:uiPriority="99" w:unhideWhenUsed="1"/>
     <w:lsdException w:name="Unresolved Mention" w:semiHidden="1" w:uiPriority="99" w:unhideWhenUsed="1"/>
+    <w:lsdException w:name="Smart Link" w:semiHidden="1" w:uiPriority="99" w:unhideWhenUsed="1"/>
   </w:latentStyles>
   <w:style w:type="paragraph" w:default="1" w:styleId="Normal">
     <w:name w:val="Normal"/>

</xml_diff>